<commit_message>
Remove roadmap/cost tab from web hub; switch middleware stack to .NET
Presentation hub no longer has a separate Roadmap & Cost section/nav
link. Integration middleware recommendation changed from Node.js/
Python to ASP.NET Core (C#) across the technical guide (md + html)
and the proposal docx, matching the team's existing .NET expertise.

Co-Authored-By: Claude Sonnet 5 <noreply@anthropic.com>
</commit_message>
<xml_diff>
--- a/deliverables/proposal/PFEC_AI_Calling_Proposal.docx
+++ b/deliverables/proposal/PFEC_AI_Calling_Proposal.docx
@@ -2160,7 +2160,7 @@
                 <w:sz w:val="19"/>
                 <w:szCs w:val="19"/>
               </w:rPr>
-              <w:t xml:space="preserve">Custom microservice (Node.js/FastAPI) on AWS/Azure</w:t>
+              <w:t xml:space="preserve">Custom microservice (ASP.NET Core / C#) on AWS/Azure</w:t>
             </w:r>
           </w:p>
         </w:tc>
@@ -3698,7 +3698,7 @@
           <w:sz w:val="21"/>
           <w:szCs w:val="21"/>
         </w:rPr>
-        <w:t xml:space="preserve">No vendor sells “Zoho CRM stage-model compliance” as a product — this has to be built. We recommend a small, stateless-where-possible service (Node.js/TypeScript or Python/FastAPI) responsible for:</w:t>
+        <w:t xml:space="preserve">No vendor sells “Zoho CRM stage-model compliance” as a product — this has to be built. We recommend a small, stateless-where-possible service (ASP.NET Core / C#) responsible for:</w:t>
       </w:r>
     </w:p>
     <w:p>

</xml_diff>